<commit_message>
Implemented new service types and had it update description and item number
</commit_message>
<xml_diff>
--- a/resources/Template.docx
+++ b/resources/Template.docx
@@ -1811,7 +1811,7 @@
                 <w:sz w:val="20"/>
                 <w:szCs w:val="20"/>
               </w:rPr>
-              <w:t>Unit Price</w:t>
+              <w:t>Total</w:t>
             </w:r>
           </w:p>
         </w:tc>
@@ -1849,7 +1849,27 @@
                 <w:sz w:val="20"/>
                 <w:szCs w:val="20"/>
               </w:rPr>
-              <w:t>{#services}{date}</w:t>
+              <w:t>{#</w:t>
+            </w:r>
+            <w:proofErr w:type="gramStart"/>
+            <w:r>
+              <w:rPr>
+                <w:rFonts w:ascii="Garet Book" w:hAnsi="Garet Book"/>
+                <w:color w:val="000000" w:themeColor="text1"/>
+                <w:sz w:val="20"/>
+                <w:szCs w:val="20"/>
+              </w:rPr>
+              <w:t>services}{</w:t>
+            </w:r>
+            <w:proofErr w:type="gramEnd"/>
+            <w:r>
+              <w:rPr>
+                <w:rFonts w:ascii="Garet Book" w:hAnsi="Garet Book"/>
+                <w:color w:val="000000" w:themeColor="text1"/>
+                <w:sz w:val="20"/>
+                <w:szCs w:val="20"/>
+              </w:rPr>
+              <w:t>date}</w:t>
             </w:r>
           </w:p>
         </w:tc>
@@ -2073,7 +2093,17 @@
                 <w:sz w:val="20"/>
                 <w:szCs w:val="20"/>
               </w:rPr>
-              <w:t>unit_price</w:t>
+              <w:t>unit_</w:t>
+            </w:r>
+            <w:proofErr w:type="gramStart"/>
+            <w:r>
+              <w:rPr>
+                <w:rFonts w:ascii="Garet Book" w:hAnsi="Garet Book"/>
+                <w:color w:val="000000" w:themeColor="text1"/>
+                <w:sz w:val="20"/>
+                <w:szCs w:val="20"/>
+              </w:rPr>
+              <w:t>price</w:t>
             </w:r>
             <w:proofErr w:type="spellEnd"/>
             <w:r>
@@ -2083,7 +2113,17 @@
                 <w:sz w:val="20"/>
                 <w:szCs w:val="20"/>
               </w:rPr>
-              <w:t>}{/}</w:t>
+              <w:t>}{</w:t>
+            </w:r>
+            <w:proofErr w:type="gramEnd"/>
+            <w:r>
+              <w:rPr>
+                <w:rFonts w:ascii="Garet Book" w:hAnsi="Garet Book"/>
+                <w:color w:val="000000" w:themeColor="text1"/>
+                <w:sz w:val="20"/>
+                <w:szCs w:val="20"/>
+              </w:rPr>
+              <w:t>/}</w:t>
             </w:r>
           </w:p>
         </w:tc>

</xml_diff>